<commit_message>
Update core SWMS pipeline, repo guidance, and template for benchmark refinement
</commit_message>
<xml_diff>
--- a/src/Safe_Method_SWMS_Template_V1.docx
+++ b/src/Safe_Method_SWMS_Template_V1.docx
@@ -1210,11 +1210,6 @@
     </w:p>
     <w:p>
       <w:pPr>
-        <w:spacing w:before="200"/>
-      </w:pPr>
-    </w:p>
-    <w:p>
-      <w:pPr>
         <w:spacing w:after="240"/>
         <w:rPr>
           <w:rFonts w:ascii="Aptos" w:hAnsi="Aptos"/>
@@ -2862,6 +2857,7 @@
                 <w:sz w:val="18"/>
                 <w:szCs w:val="18"/>
               </w:rPr>
+              <w:lastRenderedPageBreak/>
               <w:t xml:space="preserve">RISK CODE: </w:t>
             </w:r>
             <w:r>
@@ -4046,6 +4042,7 @@
                 <w:sz w:val="18"/>
                 <w:szCs w:val="18"/>
               </w:rPr>
+              <w:lastRenderedPageBreak/>
               <w:t>•  Station a spotter at ground level when pedestrians are near the zone</w:t>
             </w:r>
           </w:p>
@@ -4084,7 +4081,6 @@
                 <w:sz w:val="18"/>
                 <w:szCs w:val="18"/>
               </w:rPr>
-              <w:lastRenderedPageBreak/>
               <w:t>•  Brief all other trades — no entry to exclusion zone without supervisor approval</w:t>
             </w:r>
           </w:p>
@@ -4394,6 +4390,7 @@
                 <w:sz w:val="18"/>
                 <w:szCs w:val="18"/>
               </w:rPr>
+              <w:lastRenderedPageBreak/>
               <w:t xml:space="preserve">RISK CODE: </w:t>
             </w:r>
             <w:r>
@@ -4445,6 +4442,7 @@
                 <w:sz w:val="18"/>
                 <w:szCs w:val="18"/>
               </w:rPr>
+              <w:lastRenderedPageBreak/>
               <w:t>2.2</w:t>
             </w:r>
           </w:p>
@@ -5562,6 +5560,7 @@
                 <w:sz w:val="18"/>
                 <w:szCs w:val="18"/>
               </w:rPr>
+              <w:lastRenderedPageBreak/>
               <w:t>•  Complete rigging checklist — competent person signs off — platform not used until sign-off done</w:t>
             </w:r>
           </w:p>
@@ -5619,6 +5618,7 @@
                 <w:sz w:val="18"/>
                 <w:szCs w:val="18"/>
               </w:rPr>
+              <w:lastRenderedPageBreak/>
               <w:t>Low (2)</w:t>
             </w:r>
           </w:p>
@@ -5927,6 +5927,7 @@
                 <w:sz w:val="18"/>
                 <w:szCs w:val="18"/>
               </w:rPr>
+              <w:lastRenderedPageBreak/>
               <w:t xml:space="preserve">RISK CODE: </w:t>
             </w:r>
             <w:r>
@@ -7149,6 +7150,7 @@
                 <w:sz w:val="18"/>
                 <w:szCs w:val="18"/>
               </w:rPr>
+              <w:lastRenderedPageBreak/>
               <w:t>•  To reposition: raise to roof level, move along building face, then lower — no sideways movement while lowered</w:t>
             </w:r>
           </w:p>
@@ -7187,7 +7189,6 @@
                 <w:sz w:val="18"/>
                 <w:szCs w:val="18"/>
               </w:rPr>
-              <w:lastRenderedPageBreak/>
               <w:t>•  Confirm radio or visual communication with ground and roof crew before descending</w:t>
             </w:r>
           </w:p>
@@ -7476,6 +7477,7 @@
                 <w:sz w:val="18"/>
                 <w:szCs w:val="18"/>
               </w:rPr>
+              <w:lastRenderedPageBreak/>
               <w:t>•  Wind exceeds limit</w:t>
             </w:r>
           </w:p>
@@ -7552,7 +7554,6 @@
                 <w:sz w:val="18"/>
                 <w:szCs w:val="18"/>
               </w:rPr>
-              <w:lastRenderedPageBreak/>
               <w:t>•  Motor fault / safety device activation</w:t>
             </w:r>
           </w:p>
@@ -8665,6 +8666,7 @@
                 <w:sz w:val="18"/>
                 <w:szCs w:val="18"/>
               </w:rPr>
+              <w:lastRenderedPageBreak/>
               <w:t>•  Post "CONSTRUCTION WORK IN PROGRESS" signs at building entry and work zones with contact details</w:t>
             </w:r>
           </w:p>
@@ -8722,6 +8724,7 @@
                 <w:sz w:val="18"/>
                 <w:szCs w:val="18"/>
               </w:rPr>
+              <w:lastRenderedPageBreak/>
               <w:t>Low (1)</w:t>
             </w:r>
           </w:p>
@@ -8946,7 +8949,6 @@
                 <w:sz w:val="18"/>
                 <w:szCs w:val="18"/>
               </w:rPr>
-              <w:lastRenderedPageBreak/>
               <w:t>3.5</w:t>
             </w:r>
           </w:p>
@@ -10348,6 +10350,7 @@
                 <w:sz w:val="18"/>
                 <w:szCs w:val="18"/>
               </w:rPr>
+              <w:lastRenderedPageBreak/>
               <w:t>•  Write a site-specific rescue plan for this installation — three scenarios: (a) incapacitated worker on platform, (b) worker suspended on safety line, (c) medical emergency requiring lowering</w:t>
             </w:r>
           </w:p>
@@ -10367,7 +10370,6 @@
                 <w:sz w:val="18"/>
                 <w:szCs w:val="18"/>
               </w:rPr>
-              <w:lastRenderedPageBreak/>
               <w:t>•  Rescue equipment on site and accessible — second access route to platform height confirmed before work starts</w:t>
             </w:r>
           </w:p>
@@ -10684,6 +10686,7 @@
                 <w:sz w:val="18"/>
                 <w:szCs w:val="18"/>
               </w:rPr>
+              <w:lastRenderedPageBreak/>
               <w:t>5.  Minimum 2 persons on site</w:t>
             </w:r>
           </w:p>
@@ -10758,7 +10761,6 @@
                 <w:sz w:val="18"/>
                 <w:szCs w:val="18"/>
               </w:rPr>
-              <w:lastRenderedPageBreak/>
               <w:t>•  No second means of access to working height available</w:t>
             </w:r>
           </w:p>
@@ -14119,31 +14121,7 @@
           <w:sz w:val="18"/>
           <w:szCs w:val="18"/>
         </w:rPr>
-        <w:t xml:space="preserve">If work methods, site conditions, or hazards change — stop, complete this table, re-brief all workers, obtain new </w:t>
-      </w:r>
-      <w:proofErr w:type="gramStart"/>
-      <w:r>
-        <w:rPr>
-          <w:rFonts w:ascii="Aptos" w:hAnsi="Aptos"/>
-          <w:i/>
-          <w:iCs/>
-          <w:color w:val="C00000"/>
-          <w:sz w:val="18"/>
-          <w:szCs w:val="18"/>
-        </w:rPr>
-        <w:t>sign-offs</w:t>
-      </w:r>
-      <w:proofErr w:type="gramEnd"/>
-      <w:r>
-        <w:rPr>
-          <w:rFonts w:ascii="Aptos" w:hAnsi="Aptos"/>
-          <w:i/>
-          <w:iCs/>
-          <w:color w:val="C00000"/>
-          <w:sz w:val="18"/>
-          <w:szCs w:val="18"/>
-        </w:rPr>
-        <w:t xml:space="preserve"> before resuming. Required under WHS Regulation r.300(3).</w:t>
+        <w:t>If work methods, site conditions, or hazards change — stop, complete this table, re-brief all workers, obtain new sign-offs before resuming. Required under WHS Regulation r.300(3).</w:t>
       </w:r>
     </w:p>
     <w:tbl>
@@ -14546,368 +14524,6 @@
               </w:rPr>
               <w:t>Responsible</w:t>
             </w:r>
-          </w:p>
-        </w:tc>
-      </w:tr>
-      <w:tr>
-        <w:trPr>
-          <w:trHeight w:val="399"/>
-        </w:trPr>
-        <w:tc>
-          <w:tcPr>
-            <w:tcW w:w="1035" w:type="dxa"/>
-            <w:tcBorders>
-              <w:top w:val="dotted" w:sz="2" w:space="0" w:color="A5C9EB" w:themeColor="text2" w:themeTint="40"/>
-              <w:left w:val="dotted" w:sz="2" w:space="0" w:color="A5C9EB" w:themeColor="text2" w:themeTint="40"/>
-              <w:bottom w:val="dotted" w:sz="2" w:space="0" w:color="A5C9EB" w:themeColor="text2" w:themeTint="40"/>
-              <w:right w:val="dotted" w:sz="2" w:space="0" w:color="A5C9EB" w:themeColor="text2" w:themeTint="40"/>
-            </w:tcBorders>
-            <w:tcMar>
-              <w:top w:w="40" w:type="dxa"/>
-              <w:left w:w="80" w:type="dxa"/>
-              <w:bottom w:w="40" w:type="dxa"/>
-              <w:right w:w="80" w:type="dxa"/>
-            </w:tcMar>
-          </w:tcPr>
-          <w:p>
-            <w:pPr>
-              <w:rPr>
-                <w:rFonts w:ascii="Aptos" w:hAnsi="Aptos"/>
-                <w:sz w:val="16"/>
-                <w:szCs w:val="16"/>
-              </w:rPr>
-            </w:pPr>
-          </w:p>
-        </w:tc>
-        <w:tc>
-          <w:tcPr>
-            <w:tcW w:w="2269" w:type="dxa"/>
-            <w:tcBorders>
-              <w:top w:val="dotted" w:sz="2" w:space="0" w:color="A5C9EB" w:themeColor="text2" w:themeTint="40"/>
-              <w:left w:val="dotted" w:sz="2" w:space="0" w:color="A5C9EB" w:themeColor="text2" w:themeTint="40"/>
-              <w:bottom w:val="dotted" w:sz="2" w:space="0" w:color="A5C9EB" w:themeColor="text2" w:themeTint="40"/>
-              <w:right w:val="dotted" w:sz="2" w:space="0" w:color="A5C9EB" w:themeColor="text2" w:themeTint="40"/>
-            </w:tcBorders>
-            <w:tcMar>
-              <w:top w:w="40" w:type="dxa"/>
-              <w:left w:w="80" w:type="dxa"/>
-              <w:bottom w:w="40" w:type="dxa"/>
-              <w:right w:w="80" w:type="dxa"/>
-            </w:tcMar>
-          </w:tcPr>
-          <w:p>
-            <w:pPr>
-              <w:rPr>
-                <w:rFonts w:ascii="Aptos" w:hAnsi="Aptos"/>
-                <w:sz w:val="16"/>
-                <w:szCs w:val="16"/>
-              </w:rPr>
-            </w:pPr>
-          </w:p>
-        </w:tc>
-        <w:tc>
-          <w:tcPr>
-            <w:tcW w:w="1794" w:type="dxa"/>
-            <w:tcBorders>
-              <w:top w:val="dotted" w:sz="2" w:space="0" w:color="A5C9EB" w:themeColor="text2" w:themeTint="40"/>
-              <w:left w:val="dotted" w:sz="2" w:space="0" w:color="A5C9EB" w:themeColor="text2" w:themeTint="40"/>
-              <w:bottom w:val="dotted" w:sz="2" w:space="0" w:color="A5C9EB" w:themeColor="text2" w:themeTint="40"/>
-              <w:right w:val="dotted" w:sz="2" w:space="0" w:color="A5C9EB" w:themeColor="text2" w:themeTint="40"/>
-            </w:tcBorders>
-            <w:tcMar>
-              <w:top w:w="40" w:type="dxa"/>
-              <w:left w:w="80" w:type="dxa"/>
-              <w:bottom w:w="40" w:type="dxa"/>
-              <w:right w:w="80" w:type="dxa"/>
-            </w:tcMar>
-          </w:tcPr>
-          <w:p>
-            <w:pPr>
-              <w:rPr>
-                <w:rFonts w:ascii="Aptos" w:hAnsi="Aptos"/>
-                <w:sz w:val="16"/>
-                <w:szCs w:val="16"/>
-              </w:rPr>
-            </w:pPr>
-          </w:p>
-        </w:tc>
-        <w:tc>
-          <w:tcPr>
-            <w:tcW w:w="1134" w:type="dxa"/>
-            <w:tcBorders>
-              <w:top w:val="dotted" w:sz="2" w:space="0" w:color="A5C9EB" w:themeColor="text2" w:themeTint="40"/>
-              <w:left w:val="dotted" w:sz="2" w:space="0" w:color="A5C9EB" w:themeColor="text2" w:themeTint="40"/>
-              <w:bottom w:val="dotted" w:sz="2" w:space="0" w:color="A5C9EB" w:themeColor="text2" w:themeTint="40"/>
-              <w:right w:val="dotted" w:sz="2" w:space="0" w:color="A5C9EB" w:themeColor="text2" w:themeTint="40"/>
-            </w:tcBorders>
-            <w:tcMar>
-              <w:top w:w="40" w:type="dxa"/>
-              <w:left w:w="80" w:type="dxa"/>
-              <w:bottom w:w="40" w:type="dxa"/>
-              <w:right w:w="80" w:type="dxa"/>
-            </w:tcMar>
-          </w:tcPr>
-          <w:p>
-            <w:pPr>
-              <w:rPr>
-                <w:rFonts w:ascii="Aptos" w:hAnsi="Aptos"/>
-                <w:sz w:val="16"/>
-                <w:szCs w:val="16"/>
-              </w:rPr>
-            </w:pPr>
-          </w:p>
-        </w:tc>
-        <w:tc>
-          <w:tcPr>
-            <w:tcW w:w="5103" w:type="dxa"/>
-            <w:tcBorders>
-              <w:top w:val="dotted" w:sz="2" w:space="0" w:color="A5C9EB" w:themeColor="text2" w:themeTint="40"/>
-              <w:left w:val="dotted" w:sz="2" w:space="0" w:color="A5C9EB" w:themeColor="text2" w:themeTint="40"/>
-              <w:bottom w:val="dotted" w:sz="2" w:space="0" w:color="A5C9EB" w:themeColor="text2" w:themeTint="40"/>
-              <w:right w:val="dotted" w:sz="2" w:space="0" w:color="A5C9EB" w:themeColor="text2" w:themeTint="40"/>
-            </w:tcBorders>
-            <w:tcMar>
-              <w:top w:w="40" w:type="dxa"/>
-              <w:left w:w="80" w:type="dxa"/>
-              <w:bottom w:w="40" w:type="dxa"/>
-              <w:right w:w="80" w:type="dxa"/>
-            </w:tcMar>
-          </w:tcPr>
-          <w:p>
-            <w:pPr>
-              <w:rPr>
-                <w:rFonts w:ascii="Aptos" w:hAnsi="Aptos"/>
-                <w:sz w:val="16"/>
-                <w:szCs w:val="16"/>
-              </w:rPr>
-            </w:pPr>
-          </w:p>
-        </w:tc>
-        <w:tc>
-          <w:tcPr>
-            <w:tcW w:w="1219" w:type="dxa"/>
-            <w:tcBorders>
-              <w:top w:val="dotted" w:sz="2" w:space="0" w:color="A5C9EB" w:themeColor="text2" w:themeTint="40"/>
-              <w:left w:val="dotted" w:sz="2" w:space="0" w:color="A5C9EB" w:themeColor="text2" w:themeTint="40"/>
-              <w:bottom w:val="dotted" w:sz="2" w:space="0" w:color="A5C9EB" w:themeColor="text2" w:themeTint="40"/>
-              <w:right w:val="dotted" w:sz="2" w:space="0" w:color="A5C9EB" w:themeColor="text2" w:themeTint="40"/>
-            </w:tcBorders>
-            <w:tcMar>
-              <w:top w:w="40" w:type="dxa"/>
-              <w:left w:w="80" w:type="dxa"/>
-              <w:bottom w:w="40" w:type="dxa"/>
-              <w:right w:w="80" w:type="dxa"/>
-            </w:tcMar>
-          </w:tcPr>
-          <w:p>
-            <w:pPr>
-              <w:rPr>
-                <w:rFonts w:ascii="Aptos" w:hAnsi="Aptos"/>
-                <w:sz w:val="16"/>
-                <w:szCs w:val="16"/>
-              </w:rPr>
-            </w:pPr>
-          </w:p>
-        </w:tc>
-        <w:tc>
-          <w:tcPr>
-            <w:tcW w:w="2183" w:type="dxa"/>
-            <w:tcBorders>
-              <w:top w:val="dotted" w:sz="2" w:space="0" w:color="A5C9EB" w:themeColor="text2" w:themeTint="40"/>
-              <w:left w:val="dotted" w:sz="2" w:space="0" w:color="A5C9EB" w:themeColor="text2" w:themeTint="40"/>
-              <w:bottom w:val="dotted" w:sz="2" w:space="0" w:color="A5C9EB" w:themeColor="text2" w:themeTint="40"/>
-              <w:right w:val="dotted" w:sz="2" w:space="0" w:color="A5C9EB" w:themeColor="text2" w:themeTint="40"/>
-            </w:tcBorders>
-          </w:tcPr>
-          <w:p>
-            <w:pPr>
-              <w:rPr>
-                <w:rFonts w:ascii="Aptos" w:hAnsi="Aptos"/>
-                <w:sz w:val="16"/>
-                <w:szCs w:val="16"/>
-              </w:rPr>
-            </w:pPr>
-          </w:p>
-        </w:tc>
-      </w:tr>
-      <w:tr>
-        <w:trPr>
-          <w:trHeight w:val="399"/>
-        </w:trPr>
-        <w:tc>
-          <w:tcPr>
-            <w:tcW w:w="1035" w:type="dxa"/>
-            <w:tcBorders>
-              <w:top w:val="dotted" w:sz="2" w:space="0" w:color="A5C9EB" w:themeColor="text2" w:themeTint="40"/>
-              <w:left w:val="dotted" w:sz="2" w:space="0" w:color="A5C9EB" w:themeColor="text2" w:themeTint="40"/>
-              <w:bottom w:val="dotted" w:sz="2" w:space="0" w:color="A5C9EB" w:themeColor="text2" w:themeTint="40"/>
-              <w:right w:val="dotted" w:sz="2" w:space="0" w:color="A5C9EB" w:themeColor="text2" w:themeTint="40"/>
-            </w:tcBorders>
-            <w:tcMar>
-              <w:top w:w="40" w:type="dxa"/>
-              <w:left w:w="80" w:type="dxa"/>
-              <w:bottom w:w="40" w:type="dxa"/>
-              <w:right w:w="80" w:type="dxa"/>
-            </w:tcMar>
-          </w:tcPr>
-          <w:p>
-            <w:pPr>
-              <w:rPr>
-                <w:rFonts w:ascii="Aptos" w:hAnsi="Aptos"/>
-                <w:sz w:val="16"/>
-                <w:szCs w:val="16"/>
-              </w:rPr>
-            </w:pPr>
-          </w:p>
-        </w:tc>
-        <w:tc>
-          <w:tcPr>
-            <w:tcW w:w="2269" w:type="dxa"/>
-            <w:tcBorders>
-              <w:top w:val="dotted" w:sz="2" w:space="0" w:color="A5C9EB" w:themeColor="text2" w:themeTint="40"/>
-              <w:left w:val="dotted" w:sz="2" w:space="0" w:color="A5C9EB" w:themeColor="text2" w:themeTint="40"/>
-              <w:bottom w:val="dotted" w:sz="2" w:space="0" w:color="A5C9EB" w:themeColor="text2" w:themeTint="40"/>
-              <w:right w:val="dotted" w:sz="2" w:space="0" w:color="A5C9EB" w:themeColor="text2" w:themeTint="40"/>
-            </w:tcBorders>
-            <w:tcMar>
-              <w:top w:w="40" w:type="dxa"/>
-              <w:left w:w="80" w:type="dxa"/>
-              <w:bottom w:w="40" w:type="dxa"/>
-              <w:right w:w="80" w:type="dxa"/>
-            </w:tcMar>
-          </w:tcPr>
-          <w:p>
-            <w:pPr>
-              <w:rPr>
-                <w:rFonts w:ascii="Aptos" w:hAnsi="Aptos"/>
-                <w:sz w:val="16"/>
-                <w:szCs w:val="16"/>
-              </w:rPr>
-            </w:pPr>
-          </w:p>
-        </w:tc>
-        <w:tc>
-          <w:tcPr>
-            <w:tcW w:w="1794" w:type="dxa"/>
-            <w:tcBorders>
-              <w:top w:val="dotted" w:sz="2" w:space="0" w:color="A5C9EB" w:themeColor="text2" w:themeTint="40"/>
-              <w:left w:val="dotted" w:sz="2" w:space="0" w:color="A5C9EB" w:themeColor="text2" w:themeTint="40"/>
-              <w:bottom w:val="dotted" w:sz="2" w:space="0" w:color="A5C9EB" w:themeColor="text2" w:themeTint="40"/>
-              <w:right w:val="dotted" w:sz="2" w:space="0" w:color="A5C9EB" w:themeColor="text2" w:themeTint="40"/>
-            </w:tcBorders>
-            <w:tcMar>
-              <w:top w:w="40" w:type="dxa"/>
-              <w:left w:w="80" w:type="dxa"/>
-              <w:bottom w:w="40" w:type="dxa"/>
-              <w:right w:w="80" w:type="dxa"/>
-            </w:tcMar>
-          </w:tcPr>
-          <w:p>
-            <w:pPr>
-              <w:rPr>
-                <w:rFonts w:ascii="Aptos" w:hAnsi="Aptos"/>
-                <w:sz w:val="16"/>
-                <w:szCs w:val="16"/>
-              </w:rPr>
-            </w:pPr>
-          </w:p>
-        </w:tc>
-        <w:tc>
-          <w:tcPr>
-            <w:tcW w:w="1134" w:type="dxa"/>
-            <w:tcBorders>
-              <w:top w:val="dotted" w:sz="2" w:space="0" w:color="A5C9EB" w:themeColor="text2" w:themeTint="40"/>
-              <w:left w:val="dotted" w:sz="2" w:space="0" w:color="A5C9EB" w:themeColor="text2" w:themeTint="40"/>
-              <w:bottom w:val="dotted" w:sz="2" w:space="0" w:color="A5C9EB" w:themeColor="text2" w:themeTint="40"/>
-              <w:right w:val="dotted" w:sz="2" w:space="0" w:color="A5C9EB" w:themeColor="text2" w:themeTint="40"/>
-            </w:tcBorders>
-            <w:tcMar>
-              <w:top w:w="40" w:type="dxa"/>
-              <w:left w:w="80" w:type="dxa"/>
-              <w:bottom w:w="40" w:type="dxa"/>
-              <w:right w:w="80" w:type="dxa"/>
-            </w:tcMar>
-          </w:tcPr>
-          <w:p>
-            <w:pPr>
-              <w:rPr>
-                <w:rFonts w:ascii="Aptos" w:hAnsi="Aptos"/>
-                <w:sz w:val="16"/>
-                <w:szCs w:val="16"/>
-              </w:rPr>
-            </w:pPr>
-          </w:p>
-        </w:tc>
-        <w:tc>
-          <w:tcPr>
-            <w:tcW w:w="5103" w:type="dxa"/>
-            <w:tcBorders>
-              <w:top w:val="dotted" w:sz="2" w:space="0" w:color="A5C9EB" w:themeColor="text2" w:themeTint="40"/>
-              <w:left w:val="dotted" w:sz="2" w:space="0" w:color="A5C9EB" w:themeColor="text2" w:themeTint="40"/>
-              <w:bottom w:val="dotted" w:sz="2" w:space="0" w:color="A5C9EB" w:themeColor="text2" w:themeTint="40"/>
-              <w:right w:val="dotted" w:sz="2" w:space="0" w:color="A5C9EB" w:themeColor="text2" w:themeTint="40"/>
-            </w:tcBorders>
-            <w:tcMar>
-              <w:top w:w="40" w:type="dxa"/>
-              <w:left w:w="80" w:type="dxa"/>
-              <w:bottom w:w="40" w:type="dxa"/>
-              <w:right w:w="80" w:type="dxa"/>
-            </w:tcMar>
-          </w:tcPr>
-          <w:p>
-            <w:pPr>
-              <w:rPr>
-                <w:rFonts w:ascii="Aptos" w:hAnsi="Aptos"/>
-                <w:sz w:val="16"/>
-                <w:szCs w:val="16"/>
-              </w:rPr>
-            </w:pPr>
-          </w:p>
-        </w:tc>
-        <w:tc>
-          <w:tcPr>
-            <w:tcW w:w="1219" w:type="dxa"/>
-            <w:tcBorders>
-              <w:top w:val="dotted" w:sz="2" w:space="0" w:color="A5C9EB" w:themeColor="text2" w:themeTint="40"/>
-              <w:left w:val="dotted" w:sz="2" w:space="0" w:color="A5C9EB" w:themeColor="text2" w:themeTint="40"/>
-              <w:bottom w:val="dotted" w:sz="2" w:space="0" w:color="A5C9EB" w:themeColor="text2" w:themeTint="40"/>
-              <w:right w:val="dotted" w:sz="2" w:space="0" w:color="A5C9EB" w:themeColor="text2" w:themeTint="40"/>
-            </w:tcBorders>
-            <w:tcMar>
-              <w:top w:w="40" w:type="dxa"/>
-              <w:left w:w="80" w:type="dxa"/>
-              <w:bottom w:w="40" w:type="dxa"/>
-              <w:right w:w="80" w:type="dxa"/>
-            </w:tcMar>
-          </w:tcPr>
-          <w:p>
-            <w:pPr>
-              <w:rPr>
-                <w:rFonts w:ascii="Aptos" w:hAnsi="Aptos"/>
-                <w:sz w:val="16"/>
-                <w:szCs w:val="16"/>
-              </w:rPr>
-            </w:pPr>
-          </w:p>
-        </w:tc>
-        <w:tc>
-          <w:tcPr>
-            <w:tcW w:w="2183" w:type="dxa"/>
-            <w:tcBorders>
-              <w:top w:val="dotted" w:sz="2" w:space="0" w:color="A5C9EB" w:themeColor="text2" w:themeTint="40"/>
-              <w:left w:val="dotted" w:sz="2" w:space="0" w:color="A5C9EB" w:themeColor="text2" w:themeTint="40"/>
-              <w:bottom w:val="dotted" w:sz="2" w:space="0" w:color="A5C9EB" w:themeColor="text2" w:themeTint="40"/>
-              <w:right w:val="dotted" w:sz="2" w:space="0" w:color="A5C9EB" w:themeColor="text2" w:themeTint="40"/>
-            </w:tcBorders>
-          </w:tcPr>
-          <w:p>
-            <w:pPr>
-              <w:rPr>
-                <w:rFonts w:ascii="Aptos" w:hAnsi="Aptos"/>
-                <w:sz w:val="16"/>
-                <w:szCs w:val="16"/>
-              </w:rPr>
-            </w:pPr>
           </w:p>
         </w:tc>
       </w:tr>
@@ -16475,31 +16091,7 @@
           <w:sz w:val="18"/>
           <w:szCs w:val="18"/>
         </w:rPr>
-        <w:t xml:space="preserve">If work methods, site conditions, or hazards change — stop, complete this table, re-brief all workers, obtain new </w:t>
-      </w:r>
-      <w:proofErr w:type="gramStart"/>
-      <w:r>
-        <w:rPr>
-          <w:rFonts w:ascii="Aptos" w:hAnsi="Aptos"/>
-          <w:i/>
-          <w:iCs/>
-          <w:color w:val="C00000"/>
-          <w:sz w:val="18"/>
-          <w:szCs w:val="18"/>
-        </w:rPr>
-        <w:t>sign-offs</w:t>
-      </w:r>
-      <w:proofErr w:type="gramEnd"/>
-      <w:r>
-        <w:rPr>
-          <w:rFonts w:ascii="Aptos" w:hAnsi="Aptos"/>
-          <w:i/>
-          <w:iCs/>
-          <w:color w:val="C00000"/>
-          <w:sz w:val="18"/>
-          <w:szCs w:val="18"/>
-        </w:rPr>
-        <w:t xml:space="preserve"> before resuming. Required under WHS Regulation r.300(3).</w:t>
+        <w:t>If work methods, site conditions, or hazards change — stop, complete this table, re-brief all workers, obtain new sign-offs before resuming. Required under WHS Regulation r.300(3).</w:t>
       </w:r>
     </w:p>
     <w:tbl>
@@ -16902,368 +16494,6 @@
               </w:rPr>
               <w:t>Responsible</w:t>
             </w:r>
-          </w:p>
-        </w:tc>
-      </w:tr>
-      <w:tr>
-        <w:trPr>
-          <w:trHeight w:val="399"/>
-        </w:trPr>
-        <w:tc>
-          <w:tcPr>
-            <w:tcW w:w="1035" w:type="dxa"/>
-            <w:tcBorders>
-              <w:top w:val="dotted" w:sz="2" w:space="0" w:color="A5C9EB" w:themeColor="text2" w:themeTint="40"/>
-              <w:left w:val="dotted" w:sz="2" w:space="0" w:color="A5C9EB" w:themeColor="text2" w:themeTint="40"/>
-              <w:bottom w:val="dotted" w:sz="2" w:space="0" w:color="A5C9EB" w:themeColor="text2" w:themeTint="40"/>
-              <w:right w:val="dotted" w:sz="2" w:space="0" w:color="A5C9EB" w:themeColor="text2" w:themeTint="40"/>
-            </w:tcBorders>
-            <w:tcMar>
-              <w:top w:w="40" w:type="dxa"/>
-              <w:left w:w="80" w:type="dxa"/>
-              <w:bottom w:w="40" w:type="dxa"/>
-              <w:right w:w="80" w:type="dxa"/>
-            </w:tcMar>
-          </w:tcPr>
-          <w:p>
-            <w:pPr>
-              <w:rPr>
-                <w:rFonts w:ascii="Aptos" w:hAnsi="Aptos"/>
-                <w:sz w:val="16"/>
-                <w:szCs w:val="16"/>
-              </w:rPr>
-            </w:pPr>
-          </w:p>
-        </w:tc>
-        <w:tc>
-          <w:tcPr>
-            <w:tcW w:w="2269" w:type="dxa"/>
-            <w:tcBorders>
-              <w:top w:val="dotted" w:sz="2" w:space="0" w:color="A5C9EB" w:themeColor="text2" w:themeTint="40"/>
-              <w:left w:val="dotted" w:sz="2" w:space="0" w:color="A5C9EB" w:themeColor="text2" w:themeTint="40"/>
-              <w:bottom w:val="dotted" w:sz="2" w:space="0" w:color="A5C9EB" w:themeColor="text2" w:themeTint="40"/>
-              <w:right w:val="dotted" w:sz="2" w:space="0" w:color="A5C9EB" w:themeColor="text2" w:themeTint="40"/>
-            </w:tcBorders>
-            <w:tcMar>
-              <w:top w:w="40" w:type="dxa"/>
-              <w:left w:w="80" w:type="dxa"/>
-              <w:bottom w:w="40" w:type="dxa"/>
-              <w:right w:w="80" w:type="dxa"/>
-            </w:tcMar>
-          </w:tcPr>
-          <w:p>
-            <w:pPr>
-              <w:rPr>
-                <w:rFonts w:ascii="Aptos" w:hAnsi="Aptos"/>
-                <w:sz w:val="16"/>
-                <w:szCs w:val="16"/>
-              </w:rPr>
-            </w:pPr>
-          </w:p>
-        </w:tc>
-        <w:tc>
-          <w:tcPr>
-            <w:tcW w:w="1794" w:type="dxa"/>
-            <w:tcBorders>
-              <w:top w:val="dotted" w:sz="2" w:space="0" w:color="A5C9EB" w:themeColor="text2" w:themeTint="40"/>
-              <w:left w:val="dotted" w:sz="2" w:space="0" w:color="A5C9EB" w:themeColor="text2" w:themeTint="40"/>
-              <w:bottom w:val="dotted" w:sz="2" w:space="0" w:color="A5C9EB" w:themeColor="text2" w:themeTint="40"/>
-              <w:right w:val="dotted" w:sz="2" w:space="0" w:color="A5C9EB" w:themeColor="text2" w:themeTint="40"/>
-            </w:tcBorders>
-            <w:tcMar>
-              <w:top w:w="40" w:type="dxa"/>
-              <w:left w:w="80" w:type="dxa"/>
-              <w:bottom w:w="40" w:type="dxa"/>
-              <w:right w:w="80" w:type="dxa"/>
-            </w:tcMar>
-          </w:tcPr>
-          <w:p>
-            <w:pPr>
-              <w:rPr>
-                <w:rFonts w:ascii="Aptos" w:hAnsi="Aptos"/>
-                <w:sz w:val="16"/>
-                <w:szCs w:val="16"/>
-              </w:rPr>
-            </w:pPr>
-          </w:p>
-        </w:tc>
-        <w:tc>
-          <w:tcPr>
-            <w:tcW w:w="1134" w:type="dxa"/>
-            <w:tcBorders>
-              <w:top w:val="dotted" w:sz="2" w:space="0" w:color="A5C9EB" w:themeColor="text2" w:themeTint="40"/>
-              <w:left w:val="dotted" w:sz="2" w:space="0" w:color="A5C9EB" w:themeColor="text2" w:themeTint="40"/>
-              <w:bottom w:val="dotted" w:sz="2" w:space="0" w:color="A5C9EB" w:themeColor="text2" w:themeTint="40"/>
-              <w:right w:val="dotted" w:sz="2" w:space="0" w:color="A5C9EB" w:themeColor="text2" w:themeTint="40"/>
-            </w:tcBorders>
-            <w:tcMar>
-              <w:top w:w="40" w:type="dxa"/>
-              <w:left w:w="80" w:type="dxa"/>
-              <w:bottom w:w="40" w:type="dxa"/>
-              <w:right w:w="80" w:type="dxa"/>
-            </w:tcMar>
-          </w:tcPr>
-          <w:p>
-            <w:pPr>
-              <w:rPr>
-                <w:rFonts w:ascii="Aptos" w:hAnsi="Aptos"/>
-                <w:sz w:val="16"/>
-                <w:szCs w:val="16"/>
-              </w:rPr>
-            </w:pPr>
-          </w:p>
-        </w:tc>
-        <w:tc>
-          <w:tcPr>
-            <w:tcW w:w="5103" w:type="dxa"/>
-            <w:tcBorders>
-              <w:top w:val="dotted" w:sz="2" w:space="0" w:color="A5C9EB" w:themeColor="text2" w:themeTint="40"/>
-              <w:left w:val="dotted" w:sz="2" w:space="0" w:color="A5C9EB" w:themeColor="text2" w:themeTint="40"/>
-              <w:bottom w:val="dotted" w:sz="2" w:space="0" w:color="A5C9EB" w:themeColor="text2" w:themeTint="40"/>
-              <w:right w:val="dotted" w:sz="2" w:space="0" w:color="A5C9EB" w:themeColor="text2" w:themeTint="40"/>
-            </w:tcBorders>
-            <w:tcMar>
-              <w:top w:w="40" w:type="dxa"/>
-              <w:left w:w="80" w:type="dxa"/>
-              <w:bottom w:w="40" w:type="dxa"/>
-              <w:right w:w="80" w:type="dxa"/>
-            </w:tcMar>
-          </w:tcPr>
-          <w:p>
-            <w:pPr>
-              <w:rPr>
-                <w:rFonts w:ascii="Aptos" w:hAnsi="Aptos"/>
-                <w:sz w:val="16"/>
-                <w:szCs w:val="16"/>
-              </w:rPr>
-            </w:pPr>
-          </w:p>
-        </w:tc>
-        <w:tc>
-          <w:tcPr>
-            <w:tcW w:w="1219" w:type="dxa"/>
-            <w:tcBorders>
-              <w:top w:val="dotted" w:sz="2" w:space="0" w:color="A5C9EB" w:themeColor="text2" w:themeTint="40"/>
-              <w:left w:val="dotted" w:sz="2" w:space="0" w:color="A5C9EB" w:themeColor="text2" w:themeTint="40"/>
-              <w:bottom w:val="dotted" w:sz="2" w:space="0" w:color="A5C9EB" w:themeColor="text2" w:themeTint="40"/>
-              <w:right w:val="dotted" w:sz="2" w:space="0" w:color="A5C9EB" w:themeColor="text2" w:themeTint="40"/>
-            </w:tcBorders>
-            <w:tcMar>
-              <w:top w:w="40" w:type="dxa"/>
-              <w:left w:w="80" w:type="dxa"/>
-              <w:bottom w:w="40" w:type="dxa"/>
-              <w:right w:w="80" w:type="dxa"/>
-            </w:tcMar>
-          </w:tcPr>
-          <w:p>
-            <w:pPr>
-              <w:rPr>
-                <w:rFonts w:ascii="Aptos" w:hAnsi="Aptos"/>
-                <w:sz w:val="16"/>
-                <w:szCs w:val="16"/>
-              </w:rPr>
-            </w:pPr>
-          </w:p>
-        </w:tc>
-        <w:tc>
-          <w:tcPr>
-            <w:tcW w:w="2183" w:type="dxa"/>
-            <w:tcBorders>
-              <w:top w:val="dotted" w:sz="2" w:space="0" w:color="A5C9EB" w:themeColor="text2" w:themeTint="40"/>
-              <w:left w:val="dotted" w:sz="2" w:space="0" w:color="A5C9EB" w:themeColor="text2" w:themeTint="40"/>
-              <w:bottom w:val="dotted" w:sz="2" w:space="0" w:color="A5C9EB" w:themeColor="text2" w:themeTint="40"/>
-              <w:right w:val="dotted" w:sz="2" w:space="0" w:color="A5C9EB" w:themeColor="text2" w:themeTint="40"/>
-            </w:tcBorders>
-          </w:tcPr>
-          <w:p>
-            <w:pPr>
-              <w:rPr>
-                <w:rFonts w:ascii="Aptos" w:hAnsi="Aptos"/>
-                <w:sz w:val="16"/>
-                <w:szCs w:val="16"/>
-              </w:rPr>
-            </w:pPr>
-          </w:p>
-        </w:tc>
-      </w:tr>
-      <w:tr>
-        <w:trPr>
-          <w:trHeight w:val="399"/>
-        </w:trPr>
-        <w:tc>
-          <w:tcPr>
-            <w:tcW w:w="1035" w:type="dxa"/>
-            <w:tcBorders>
-              <w:top w:val="dotted" w:sz="2" w:space="0" w:color="A5C9EB" w:themeColor="text2" w:themeTint="40"/>
-              <w:left w:val="dotted" w:sz="2" w:space="0" w:color="A5C9EB" w:themeColor="text2" w:themeTint="40"/>
-              <w:bottom w:val="dotted" w:sz="2" w:space="0" w:color="A5C9EB" w:themeColor="text2" w:themeTint="40"/>
-              <w:right w:val="dotted" w:sz="2" w:space="0" w:color="A5C9EB" w:themeColor="text2" w:themeTint="40"/>
-            </w:tcBorders>
-            <w:tcMar>
-              <w:top w:w="40" w:type="dxa"/>
-              <w:left w:w="80" w:type="dxa"/>
-              <w:bottom w:w="40" w:type="dxa"/>
-              <w:right w:w="80" w:type="dxa"/>
-            </w:tcMar>
-          </w:tcPr>
-          <w:p>
-            <w:pPr>
-              <w:rPr>
-                <w:rFonts w:ascii="Aptos" w:hAnsi="Aptos"/>
-                <w:sz w:val="16"/>
-                <w:szCs w:val="16"/>
-              </w:rPr>
-            </w:pPr>
-          </w:p>
-        </w:tc>
-        <w:tc>
-          <w:tcPr>
-            <w:tcW w:w="2269" w:type="dxa"/>
-            <w:tcBorders>
-              <w:top w:val="dotted" w:sz="2" w:space="0" w:color="A5C9EB" w:themeColor="text2" w:themeTint="40"/>
-              <w:left w:val="dotted" w:sz="2" w:space="0" w:color="A5C9EB" w:themeColor="text2" w:themeTint="40"/>
-              <w:bottom w:val="dotted" w:sz="2" w:space="0" w:color="A5C9EB" w:themeColor="text2" w:themeTint="40"/>
-              <w:right w:val="dotted" w:sz="2" w:space="0" w:color="A5C9EB" w:themeColor="text2" w:themeTint="40"/>
-            </w:tcBorders>
-            <w:tcMar>
-              <w:top w:w="40" w:type="dxa"/>
-              <w:left w:w="80" w:type="dxa"/>
-              <w:bottom w:w="40" w:type="dxa"/>
-              <w:right w:w="80" w:type="dxa"/>
-            </w:tcMar>
-          </w:tcPr>
-          <w:p>
-            <w:pPr>
-              <w:rPr>
-                <w:rFonts w:ascii="Aptos" w:hAnsi="Aptos"/>
-                <w:sz w:val="16"/>
-                <w:szCs w:val="16"/>
-              </w:rPr>
-            </w:pPr>
-          </w:p>
-        </w:tc>
-        <w:tc>
-          <w:tcPr>
-            <w:tcW w:w="1794" w:type="dxa"/>
-            <w:tcBorders>
-              <w:top w:val="dotted" w:sz="2" w:space="0" w:color="A5C9EB" w:themeColor="text2" w:themeTint="40"/>
-              <w:left w:val="dotted" w:sz="2" w:space="0" w:color="A5C9EB" w:themeColor="text2" w:themeTint="40"/>
-              <w:bottom w:val="dotted" w:sz="2" w:space="0" w:color="A5C9EB" w:themeColor="text2" w:themeTint="40"/>
-              <w:right w:val="dotted" w:sz="2" w:space="0" w:color="A5C9EB" w:themeColor="text2" w:themeTint="40"/>
-            </w:tcBorders>
-            <w:tcMar>
-              <w:top w:w="40" w:type="dxa"/>
-              <w:left w:w="80" w:type="dxa"/>
-              <w:bottom w:w="40" w:type="dxa"/>
-              <w:right w:w="80" w:type="dxa"/>
-            </w:tcMar>
-          </w:tcPr>
-          <w:p>
-            <w:pPr>
-              <w:rPr>
-                <w:rFonts w:ascii="Aptos" w:hAnsi="Aptos"/>
-                <w:sz w:val="16"/>
-                <w:szCs w:val="16"/>
-              </w:rPr>
-            </w:pPr>
-          </w:p>
-        </w:tc>
-        <w:tc>
-          <w:tcPr>
-            <w:tcW w:w="1134" w:type="dxa"/>
-            <w:tcBorders>
-              <w:top w:val="dotted" w:sz="2" w:space="0" w:color="A5C9EB" w:themeColor="text2" w:themeTint="40"/>
-              <w:left w:val="dotted" w:sz="2" w:space="0" w:color="A5C9EB" w:themeColor="text2" w:themeTint="40"/>
-              <w:bottom w:val="dotted" w:sz="2" w:space="0" w:color="A5C9EB" w:themeColor="text2" w:themeTint="40"/>
-              <w:right w:val="dotted" w:sz="2" w:space="0" w:color="A5C9EB" w:themeColor="text2" w:themeTint="40"/>
-            </w:tcBorders>
-            <w:tcMar>
-              <w:top w:w="40" w:type="dxa"/>
-              <w:left w:w="80" w:type="dxa"/>
-              <w:bottom w:w="40" w:type="dxa"/>
-              <w:right w:w="80" w:type="dxa"/>
-            </w:tcMar>
-          </w:tcPr>
-          <w:p>
-            <w:pPr>
-              <w:rPr>
-                <w:rFonts w:ascii="Aptos" w:hAnsi="Aptos"/>
-                <w:sz w:val="16"/>
-                <w:szCs w:val="16"/>
-              </w:rPr>
-            </w:pPr>
-          </w:p>
-        </w:tc>
-        <w:tc>
-          <w:tcPr>
-            <w:tcW w:w="5103" w:type="dxa"/>
-            <w:tcBorders>
-              <w:top w:val="dotted" w:sz="2" w:space="0" w:color="A5C9EB" w:themeColor="text2" w:themeTint="40"/>
-              <w:left w:val="dotted" w:sz="2" w:space="0" w:color="A5C9EB" w:themeColor="text2" w:themeTint="40"/>
-              <w:bottom w:val="dotted" w:sz="2" w:space="0" w:color="A5C9EB" w:themeColor="text2" w:themeTint="40"/>
-              <w:right w:val="dotted" w:sz="2" w:space="0" w:color="A5C9EB" w:themeColor="text2" w:themeTint="40"/>
-            </w:tcBorders>
-            <w:tcMar>
-              <w:top w:w="40" w:type="dxa"/>
-              <w:left w:w="80" w:type="dxa"/>
-              <w:bottom w:w="40" w:type="dxa"/>
-              <w:right w:w="80" w:type="dxa"/>
-            </w:tcMar>
-          </w:tcPr>
-          <w:p>
-            <w:pPr>
-              <w:rPr>
-                <w:rFonts w:ascii="Aptos" w:hAnsi="Aptos"/>
-                <w:sz w:val="16"/>
-                <w:szCs w:val="16"/>
-              </w:rPr>
-            </w:pPr>
-          </w:p>
-        </w:tc>
-        <w:tc>
-          <w:tcPr>
-            <w:tcW w:w="1219" w:type="dxa"/>
-            <w:tcBorders>
-              <w:top w:val="dotted" w:sz="2" w:space="0" w:color="A5C9EB" w:themeColor="text2" w:themeTint="40"/>
-              <w:left w:val="dotted" w:sz="2" w:space="0" w:color="A5C9EB" w:themeColor="text2" w:themeTint="40"/>
-              <w:bottom w:val="dotted" w:sz="2" w:space="0" w:color="A5C9EB" w:themeColor="text2" w:themeTint="40"/>
-              <w:right w:val="dotted" w:sz="2" w:space="0" w:color="A5C9EB" w:themeColor="text2" w:themeTint="40"/>
-            </w:tcBorders>
-            <w:tcMar>
-              <w:top w:w="40" w:type="dxa"/>
-              <w:left w:w="80" w:type="dxa"/>
-              <w:bottom w:w="40" w:type="dxa"/>
-              <w:right w:w="80" w:type="dxa"/>
-            </w:tcMar>
-          </w:tcPr>
-          <w:p>
-            <w:pPr>
-              <w:rPr>
-                <w:rFonts w:ascii="Aptos" w:hAnsi="Aptos"/>
-                <w:sz w:val="16"/>
-                <w:szCs w:val="16"/>
-              </w:rPr>
-            </w:pPr>
-          </w:p>
-        </w:tc>
-        <w:tc>
-          <w:tcPr>
-            <w:tcW w:w="2183" w:type="dxa"/>
-            <w:tcBorders>
-              <w:top w:val="dotted" w:sz="2" w:space="0" w:color="A5C9EB" w:themeColor="text2" w:themeTint="40"/>
-              <w:left w:val="dotted" w:sz="2" w:space="0" w:color="A5C9EB" w:themeColor="text2" w:themeTint="40"/>
-              <w:bottom w:val="dotted" w:sz="2" w:space="0" w:color="A5C9EB" w:themeColor="text2" w:themeTint="40"/>
-              <w:right w:val="dotted" w:sz="2" w:space="0" w:color="A5C9EB" w:themeColor="text2" w:themeTint="40"/>
-            </w:tcBorders>
-          </w:tcPr>
-          <w:p>
-            <w:pPr>
-              <w:rPr>
-                <w:rFonts w:ascii="Aptos" w:hAnsi="Aptos"/>
-                <w:sz w:val="16"/>
-                <w:szCs w:val="16"/>
-              </w:rPr>
-            </w:pPr>
           </w:p>
         </w:tc>
       </w:tr>
@@ -18034,6 +17264,11 @@
         </w:rPr>
       </w:pPr>
     </w:p>
+    <w:p>
+      <w:r>
+        <w:br w:type="page"/>
+      </w:r>
+    </w:p>
     <w:tbl>
       <w:tblPr>
         <w:tblW w:w="14688" w:type="dxa"/>
@@ -18086,6 +17321,7 @@
                 <w:bCs/>
                 <w:color w:val="FFFFFF"/>
               </w:rPr>
+              <w:lastRenderedPageBreak/>
               <w:t>RISK RATING MATRIX — Consequence × Likelihood</w:t>
             </w:r>
           </w:p>

</xml_diff>